<commit_message>
Add developer information and project description to Student Performance document
</commit_message>
<xml_diff>
--- a/PowerBi/Exam/Student_Performance.docx
+++ b/PowerBi/Exam/Student_Performance.docx
@@ -207,7 +207,7 @@
     <w:p>
       <w:r>
         <w:pict w14:anchorId="5D275D19">
-          <v:rect id="_x0000_i1157" style="width:0;height:1.5pt" o:hralign="center" o:hrstd="t" o:hr="t" fillcolor="#a0a0a0" stroked="f"/>
+          <v:rect id="_x0000_i1025" style="width:0;height:1.5pt" o:hralign="center" o:hrstd="t" o:hr="t" fillcolor="#a0a0a0" stroked="f"/>
         </w:pict>
       </w:r>
     </w:p>
@@ -474,7 +474,7 @@
     <w:p>
       <w:r>
         <w:pict w14:anchorId="4A2B6B8D">
-          <v:rect id="_x0000_i1158" style="width:0;height:1.5pt" o:hralign="center" o:hrstd="t" o:hr="t" fillcolor="#a0a0a0" stroked="f"/>
+          <v:rect id="_x0000_i1026" style="width:0;height:1.5pt" o:hralign="center" o:hrstd="t" o:hr="t" fillcolor="#a0a0a0" stroked="f"/>
         </w:pict>
       </w:r>
     </w:p>
@@ -747,7 +747,7 @@
     <w:p>
       <w:r>
         <w:pict w14:anchorId="7EC9CBBF">
-          <v:rect id="_x0000_i1159" style="width:0;height:1.5pt" o:hralign="center" o:hrstd="t" o:hr="t" fillcolor="#a0a0a0" stroked="f"/>
+          <v:rect id="_x0000_i1027" style="width:0;height:1.5pt" o:hralign="center" o:hrstd="t" o:hr="t" fillcolor="#a0a0a0" stroked="f"/>
         </w:pict>
       </w:r>
     </w:p>
@@ -957,7 +957,7 @@
     <w:p>
       <w:r>
         <w:pict w14:anchorId="1E9A6230">
-          <v:rect id="_x0000_i1160" style="width:0;height:1.5pt" o:hralign="center" o:hrstd="t" o:hr="t" fillcolor="#a0a0a0" stroked="f"/>
+          <v:rect id="_x0000_i1028" style="width:0;height:1.5pt" o:hralign="center" o:hrstd="t" o:hr="t" fillcolor="#a0a0a0" stroked="f"/>
         </w:pict>
       </w:r>
     </w:p>
@@ -1182,7 +1182,7 @@
     <w:p>
       <w:r>
         <w:pict w14:anchorId="23B59266">
-          <v:rect id="_x0000_i1161" style="width:0;height:1.5pt" o:hralign="center" o:hrstd="t" o:hr="t" fillcolor="#a0a0a0" stroked="f"/>
+          <v:rect id="_x0000_i1029" style="width:0;height:1.5pt" o:hralign="center" o:hrstd="t" o:hr="t" fillcolor="#a0a0a0" stroked="f"/>
         </w:pict>
       </w:r>
     </w:p>
@@ -1283,7 +1283,7 @@
     <w:p>
       <w:r>
         <w:pict w14:anchorId="07BE070F">
-          <v:rect id="_x0000_i1162" style="width:0;height:1.5pt" o:hralign="center" o:hrstd="t" o:hr="t" fillcolor="#a0a0a0" stroked="f"/>
+          <v:rect id="_x0000_i1030" style="width:0;height:1.5pt" o:hralign="center" o:hrstd="t" o:hr="t" fillcolor="#a0a0a0" stroked="f"/>
         </w:pict>
       </w:r>
     </w:p>
@@ -1410,6 +1410,9 @@
     </w:p>
     <w:p>
       <w:r>
+        <w:rPr>
+          <w:noProof/>
+        </w:rPr>
         <w:drawing>
           <wp:inline distT="0" distB="0" distL="0" distR="0" wp14:anchorId="514E39CB" wp14:editId="6F00D303">
             <wp:extent cx="5731510" cy="2545715"/>
@@ -1450,7 +1453,7 @@
     <w:p>
       <w:r>
         <w:pict w14:anchorId="2021802D">
-          <v:rect id="_x0000_i1163" style="width:0;height:1.5pt" o:hralign="center" o:hrstd="t" o:hr="t" fillcolor="#a0a0a0" stroked="f"/>
+          <v:rect id="_x0000_i1031" style="width:0;height:1.5pt" o:hralign="center" o:hrstd="t" o:hr="t" fillcolor="#a0a0a0" stroked="f"/>
         </w:pict>
       </w:r>
     </w:p>
@@ -1670,6 +1673,9 @@
     </w:p>
     <w:p>
       <w:r>
+        <w:rPr>
+          <w:noProof/>
+        </w:rPr>
         <w:drawing>
           <wp:inline distT="0" distB="0" distL="0" distR="0" wp14:anchorId="75BFC4CD" wp14:editId="58EDE03C">
             <wp:extent cx="2248214" cy="3267531"/>
@@ -1710,7 +1716,7 @@
     <w:p>
       <w:r>
         <w:pict w14:anchorId="403EFAE4">
-          <v:rect id="_x0000_i1164" style="width:0;height:1.5pt" o:hralign="center" o:hrstd="t" o:hr="t" fillcolor="#a0a0a0" stroked="f"/>
+          <v:rect id="_x0000_i1032" style="width:0;height:1.5pt" o:hralign="center" o:hrstd="t" o:hr="t" fillcolor="#a0a0a0" stroked="f"/>
         </w:pict>
       </w:r>
     </w:p>
@@ -1884,6 +1890,9 @@
     </w:p>
     <w:p>
       <w:r>
+        <w:rPr>
+          <w:noProof/>
+        </w:rPr>
         <w:drawing>
           <wp:inline distT="0" distB="0" distL="0" distR="0" wp14:anchorId="46F992E3" wp14:editId="6F84F50A">
             <wp:extent cx="2362530" cy="2105319"/>
@@ -1924,7 +1933,7 @@
     <w:p>
       <w:r>
         <w:pict w14:anchorId="4B2BCDAD">
-          <v:rect id="_x0000_i1165" style="width:0;height:1.5pt" o:hralign="center" o:hrstd="t" o:hr="t" fillcolor="#a0a0a0" stroked="f"/>
+          <v:rect id="_x0000_i1033" style="width:0;height:1.5pt" o:hralign="center" o:hrstd="t" o:hr="t" fillcolor="#a0a0a0" stroked="f"/>
         </w:pict>
       </w:r>
     </w:p>
@@ -1941,6 +1950,7 @@
           <w:rFonts w:ascii="Segoe UI Emoji" w:hAnsi="Segoe UI Emoji" w:cs="Segoe UI Emoji"/>
           <w:b/>
           <w:bCs/>
+          <w:noProof/>
         </w:rPr>
         <w:drawing>
           <wp:inline distT="0" distB="0" distL="0" distR="0" wp14:anchorId="19D800CB" wp14:editId="0EC4AC44">
@@ -2078,7 +2088,7 @@
     <w:p>
       <w:r>
         <w:pict w14:anchorId="6A7E3F4F">
-          <v:rect id="_x0000_i1166" style="width:0;height:1.5pt" o:hralign="center" o:hrstd="t" o:hr="t" fillcolor="#a0a0a0" stroked="f"/>
+          <v:rect id="_x0000_i1034" style="width:0;height:1.5pt" o:hralign="center" o:hrstd="t" o:hr="t" fillcolor="#a0a0a0" stroked="f"/>
         </w:pict>
       </w:r>
     </w:p>
@@ -2139,7 +2149,7 @@
     <w:p>
       <w:r>
         <w:pict w14:anchorId="084FB542">
-          <v:rect id="_x0000_i1167" style="width:0;height:1.5pt" o:hralign="center" o:hrstd="t" o:hr="t" fillcolor="#a0a0a0" stroked="f"/>
+          <v:rect id="_x0000_i1035" style="width:0;height:1.5pt" o:hralign="center" o:hrstd="t" o:hr="t" fillcolor="#a0a0a0" stroked="f"/>
         </w:pict>
       </w:r>
     </w:p>
@@ -2177,7 +2187,7 @@
     <w:p>
       <w:r>
         <w:pict w14:anchorId="74E96C9B">
-          <v:rect id="_x0000_i1168" style="width:0;height:1.5pt" o:hralign="center" o:hrstd="t" o:hr="t" fillcolor="#a0a0a0" stroked="f"/>
+          <v:rect id="_x0000_i1036" style="width:0;height:1.5pt" o:hralign="center" o:hrstd="t" o:hr="t" fillcolor="#a0a0a0" stroked="f"/>
         </w:pict>
       </w:r>
     </w:p>
@@ -2220,7 +2230,7 @@
     <w:p>
       <w:r>
         <w:pict w14:anchorId="39F86906">
-          <v:rect id="_x0000_i1169" style="width:0;height:1.5pt" o:hralign="center" o:hrstd="t" o:hr="t" fillcolor="#a0a0a0" stroked="f"/>
+          <v:rect id="_x0000_i1037" style="width:0;height:1.5pt" o:hralign="center" o:hrstd="t" o:hr="t" fillcolor="#a0a0a0" stroked="f"/>
         </w:pict>
       </w:r>
     </w:p>
@@ -2422,7 +2432,7 @@
     <w:p>
       <w:r>
         <w:pict w14:anchorId="09E1E89E">
-          <v:rect id="_x0000_i1170" style="width:0;height:1.5pt" o:hralign="center" o:hrstd="t" o:hr="t" fillcolor="#a0a0a0" stroked="f"/>
+          <v:rect id="_x0000_i1038" style="width:0;height:1.5pt" o:hralign="center" o:hrstd="t" o:hr="t" fillcolor="#a0a0a0" stroked="f"/>
         </w:pict>
       </w:r>
     </w:p>
@@ -2439,6 +2449,7 @@
           <w:rFonts w:ascii="Segoe UI Emoji" w:hAnsi="Segoe UI Emoji" w:cs="Segoe UI Emoji"/>
           <w:b/>
           <w:bCs/>
+          <w:noProof/>
         </w:rPr>
         <w:lastRenderedPageBreak/>
         <w:drawing>
@@ -2576,7 +2587,7 @@
     <w:p>
       <w:r>
         <w:pict w14:anchorId="3AA5BC48">
-          <v:rect id="_x0000_i1171" style="width:0;height:1.5pt" o:hralign="center" o:hrstd="t" o:hr="t" fillcolor="#a0a0a0" stroked="f"/>
+          <v:rect id="_x0000_i1039" style="width:0;height:1.5pt" o:hralign="center" o:hrstd="t" o:hr="t" fillcolor="#a0a0a0" stroked="f"/>
         </w:pict>
       </w:r>
     </w:p>
@@ -2593,6 +2604,7 @@
           <w:rFonts w:ascii="Segoe UI Emoji" w:hAnsi="Segoe UI Emoji" w:cs="Segoe UI Emoji"/>
           <w:b/>
           <w:bCs/>
+          <w:noProof/>
         </w:rPr>
         <w:lastRenderedPageBreak/>
         <w:drawing>
@@ -2645,6 +2657,7 @@
           <w:rFonts w:ascii="Segoe UI Emoji" w:hAnsi="Segoe UI Emoji" w:cs="Segoe UI Emoji"/>
           <w:b/>
           <w:bCs/>
+          <w:noProof/>
         </w:rPr>
         <w:drawing>
           <wp:inline distT="0" distB="0" distL="0" distR="0" wp14:anchorId="1755F3A2" wp14:editId="518F26BF">
@@ -2789,7 +2802,7 @@
     <w:p>
       <w:r>
         <w:pict w14:anchorId="0334E98E">
-          <v:rect id="_x0000_i1172" style="width:0;height:1.5pt" o:hralign="center" o:hrstd="t" o:hr="t" fillcolor="#a0a0a0" stroked="f"/>
+          <v:rect id="_x0000_i1040" style="width:0;height:1.5pt" o:hralign="center" o:hrstd="t" o:hr="t" fillcolor="#a0a0a0" stroked="f"/>
         </w:pict>
       </w:r>
     </w:p>
@@ -2806,6 +2819,7 @@
           <w:rFonts w:ascii="Segoe UI Emoji" w:hAnsi="Segoe UI Emoji" w:cs="Segoe UI Emoji"/>
           <w:b/>
           <w:bCs/>
+          <w:noProof/>
         </w:rPr>
         <w:lastRenderedPageBreak/>
         <w:drawing>
@@ -2909,7 +2923,7 @@
     <w:p>
       <w:r>
         <w:pict w14:anchorId="1FF0A66F">
-          <v:rect id="_x0000_i1173" style="width:0;height:1.5pt" o:hralign="center" o:hrstd="t" o:hr="t" fillcolor="#a0a0a0" stroked="f"/>
+          <v:rect id="_x0000_i1041" style="width:0;height:1.5pt" o:hralign="center" o:hrstd="t" o:hr="t" fillcolor="#a0a0a0" stroked="f"/>
         </w:pict>
       </w:r>
     </w:p>
@@ -2926,6 +2940,7 @@
           <w:rFonts w:ascii="Segoe UI Emoji" w:hAnsi="Segoe UI Emoji" w:cs="Segoe UI Emoji"/>
           <w:b/>
           <w:bCs/>
+          <w:noProof/>
         </w:rPr>
         <w:lastRenderedPageBreak/>
         <w:drawing>
@@ -3023,7 +3038,7 @@
     <w:p>
       <w:r>
         <w:pict w14:anchorId="6E2DAC7E">
-          <v:rect id="_x0000_i1174" style="width:0;height:1.5pt" o:hralign="center" o:hrstd="t" o:hr="t" fillcolor="#a0a0a0" stroked="f"/>
+          <v:rect id="_x0000_i1042" style="width:0;height:1.5pt" o:hralign="center" o:hrstd="t" o:hr="t" fillcolor="#a0a0a0" stroked="f"/>
         </w:pict>
       </w:r>
     </w:p>
@@ -3040,6 +3055,7 @@
           <w:rFonts w:ascii="Segoe UI Emoji" w:hAnsi="Segoe UI Emoji" w:cs="Segoe UI Emoji"/>
           <w:b/>
           <w:bCs/>
+          <w:noProof/>
         </w:rPr>
         <w:lastRenderedPageBreak/>
         <w:drawing>
@@ -3110,7 +3126,7 @@
     <w:p>
       <w:r>
         <w:pict w14:anchorId="693F4925">
-          <v:rect id="_x0000_i1175" style="width:0;height:1.5pt" o:hralign="center" o:hrstd="t" o:hr="t" fillcolor="#a0a0a0" stroked="f"/>
+          <v:rect id="_x0000_i1043" style="width:0;height:1.5pt" o:hralign="center" o:hrstd="t" o:hr="t" fillcolor="#a0a0a0" stroked="f"/>
         </w:pict>
       </w:r>
     </w:p>
@@ -3122,7 +3138,7 @@
     <w:p>
       <w:r>
         <w:pict w14:anchorId="3BE5F585">
-          <v:rect id="_x0000_i1176" style="width:0;height:1.5pt" o:hralign="center" o:hrstd="t" o:hr="t" fillcolor="#a0a0a0" stroked="f"/>
+          <v:rect id="_x0000_i1044" style="width:0;height:1.5pt" o:hralign="center" o:hrstd="t" o:hr="t" fillcolor="#a0a0a0" stroked="f"/>
         </w:pict>
       </w:r>
     </w:p>
@@ -3213,7 +3229,7 @@
     <w:p>
       <w:r>
         <w:pict w14:anchorId="0008CA6F">
-          <v:rect id="_x0000_i1177" style="width:0;height:1.5pt" o:hralign="center" o:hrstd="t" o:hr="t" fillcolor="#a0a0a0" stroked="f"/>
+          <v:rect id="_x0000_i1045" style="width:0;height:1.5pt" o:hralign="center" o:hrstd="t" o:hr="t" fillcolor="#a0a0a0" stroked="f"/>
         </w:pict>
       </w:r>
     </w:p>
@@ -3426,7 +3442,7 @@
     <w:p>
       <w:r>
         <w:pict w14:anchorId="6C4AB301">
-          <v:rect id="_x0000_i1178" style="width:0;height:1.5pt" o:hralign="center" o:hrstd="t" o:hr="t" fillcolor="#a0a0a0" stroked="f"/>
+          <v:rect id="_x0000_i1046" style="width:0;height:1.5pt" o:hralign="center" o:hrstd="t" o:hr="t" fillcolor="#a0a0a0" stroked="f"/>
         </w:pict>
       </w:r>
     </w:p>
@@ -3573,6 +3589,76 @@
         <w:t>, helping users perform efficient educational analysis and decision-making.</w:t>
       </w:r>
     </w:p>
+    <w:p>
+      <w:r>
+        <w:pict w14:anchorId="6494B0F9">
+          <v:rect id="_x0000_i1059" style="width:0;height:1.5pt" o:hralign="center" o:hrstd="t" o:hr="t" fillcolor="#a0a0a0" stroked="f"/>
+        </w:pict>
+      </w:r>
+    </w:p>
+    <w:p>
+      <w:pPr>
+        <w:rPr>
+          <w:b/>
+          <w:bCs/>
+        </w:rPr>
+      </w:pPr>
+      <w:r>
+        <w:rPr>
+          <w:rFonts w:ascii="Segoe UI Emoji" w:hAnsi="Segoe UI Emoji" w:cs="Segoe UI Emoji"/>
+          <w:b/>
+          <w:bCs/>
+        </w:rPr>
+        <w:t>👨</w:t>
+      </w:r>
+      <w:r>
+        <w:rPr>
+          <w:b/>
+          <w:bCs/>
+        </w:rPr>
+        <w:t>‍</w:t>
+      </w:r>
+      <w:r>
+        <w:rPr>
+          <w:rFonts w:ascii="Segoe UI Emoji" w:hAnsi="Segoe UI Emoji" w:cs="Segoe UI Emoji"/>
+          <w:b/>
+          <w:bCs/>
+        </w:rPr>
+        <w:t>💻</w:t>
+      </w:r>
+      <w:r>
+        <w:rPr>
+          <w:b/>
+          <w:bCs/>
+        </w:rPr>
+        <w:t xml:space="preserve"> Developed By</w:t>
+      </w:r>
+    </w:p>
+    <w:p>
+      <w:r>
+        <w:rPr>
+          <w:b/>
+          <w:bCs/>
+        </w:rPr>
+        <w:t>Priyansh Vekariya</w:t>
+      </w:r>
+      <w:r>
+        <w:br/>
+        <w:t>Student Performance Dashboard Project</w:t>
+      </w:r>
+      <w:r>
+        <w:br/>
+        <w:t>Developed using Power BI, DAX, Power Query, and interactive data visualization techniques.</w:t>
+      </w:r>
+    </w:p>
+    <w:p>
+      <w:r>
+        <w:pict w14:anchorId="37561FD7">
+          <v:rect id="_x0000_i1060" style="width:0;height:1.5pt" o:hralign="center" o:hrstd="t" o:hr="t" fillcolor="#a0a0a0" stroked="f"/>
+        </w:pict>
+      </w:r>
+    </w:p>
+    <w:p/>
     <w:p/>
     <w:sectPr>
       <w:pgSz w:w="11906" w:h="16838"/>

</xml_diff>